<commit_message>
Added Collision Detection - Pending Collision Resolution
</commit_message>
<xml_diff>
--- a/Docs/Physics Engine - Phase A.docx
+++ b/Docs/Physics Engine - Phase A.docx
@@ -32,15 +32,7 @@
         <w:pStyle w:val="Heading1"/>
       </w:pPr>
       <w:r>
-        <w:t xml:space="preserve">Phase A: Core </w:t>
-      </w:r>
-      <w:proofErr w:type="spellStart"/>
-      <w:r>
-        <w:t>RigidBody</w:t>
-      </w:r>
-      <w:proofErr w:type="spellEnd"/>
-      <w:r>
-        <w:t xml:space="preserve"> Motion</w:t>
+        <w:t>Phase A: Core RigidBody Motion</w:t>
       </w:r>
     </w:p>
     <w:p>
@@ -175,13 +167,8 @@
           <w:numId w:val="1"/>
         </w:numPr>
       </w:pPr>
-      <w:proofErr w:type="spellStart"/>
-      <w:r>
-        <w:t>RigidBody</w:t>
-      </w:r>
-      <w:proofErr w:type="spellEnd"/>
-      <w:r>
-        <w:t xml:space="preserve"> representation</w:t>
+      <w:r>
+        <w:t>RigidBody representation</w:t>
       </w:r>
     </w:p>
     <w:p>
@@ -239,15 +226,8 @@
           <w:numId w:val="1"/>
         </w:numPr>
       </w:pPr>
-      <w:proofErr w:type="spellStart"/>
-      <w:proofErr w:type="gramStart"/>
-      <w:r>
-        <w:t>PhysicsWorld</w:t>
-      </w:r>
-      <w:proofErr w:type="spellEnd"/>
-      <w:proofErr w:type="gramEnd"/>
-      <w:r>
-        <w:t xml:space="preserve"> as the simulation authority</w:t>
+      <w:r>
+        <w:t>PhysicsWorld as the simulation authority</w:t>
       </w:r>
     </w:p>
     <w:p>
@@ -258,15 +238,7 @@
         </w:numPr>
       </w:pPr>
       <w:r>
-        <w:t xml:space="preserve">Use of </w:t>
-      </w:r>
-      <w:proofErr w:type="spellStart"/>
-      <w:r>
-        <w:t>Irrlicht</w:t>
-      </w:r>
-      <w:proofErr w:type="spellEnd"/>
-      <w:r>
-        <w:t xml:space="preserve"> math types (vector3df, quaternion)</w:t>
+        <w:t>Use of Irrlicht math types (vector3df, quaternion)</w:t>
       </w:r>
     </w:p>
     <w:p>
@@ -377,13 +349,8 @@
           <w:numId w:val="2"/>
         </w:numPr>
       </w:pPr>
-      <w:proofErr w:type="spellStart"/>
-      <w:r>
-        <w:t>Irrlicht</w:t>
-      </w:r>
-      <w:proofErr w:type="spellEnd"/>
-      <w:r>
-        <w:t xml:space="preserve"> scene management</w:t>
+      <w:r>
+        <w:t>Irrlicht scene management</w:t>
       </w:r>
     </w:p>
     <w:p>
@@ -409,7 +376,6 @@
           <w:bCs/>
         </w:rPr>
       </w:pPr>
-      <w:proofErr w:type="spellStart"/>
       <w:r>
         <w:rPr>
           <w:b/>
@@ -417,19 +383,10 @@
         </w:rPr>
         <w:t>RigidBody</w:t>
       </w:r>
-      <w:proofErr w:type="spellEnd"/>
-    </w:p>
-    <w:p>
-      <w:r>
-        <w:t xml:space="preserve">A </w:t>
-      </w:r>
-      <w:proofErr w:type="spellStart"/>
-      <w:r>
-        <w:t>RigidBody</w:t>
-      </w:r>
-      <w:proofErr w:type="spellEnd"/>
-      <w:r>
-        <w:t xml:space="preserve"> represents a physical object that:</w:t>
+    </w:p>
+    <w:p>
+      <w:r>
+        <w:t>A RigidBody represents a physical object that:</w:t>
       </w:r>
     </w:p>
     <w:p>
@@ -478,15 +435,7 @@
     </w:p>
     <w:p>
       <w:r>
-        <w:t xml:space="preserve">A </w:t>
-      </w:r>
-      <w:proofErr w:type="spellStart"/>
-      <w:r>
-        <w:t>RigidBody</w:t>
-      </w:r>
-      <w:proofErr w:type="spellEnd"/>
-      <w:r>
-        <w:t xml:space="preserve"> does </w:t>
+        <w:t xml:space="preserve">A RigidBody does </w:t>
       </w:r>
       <w:r>
         <w:rPr>
@@ -569,8 +518,6 @@
           <w:bCs/>
         </w:rPr>
       </w:pPr>
-      <w:proofErr w:type="spellStart"/>
-      <w:proofErr w:type="gramStart"/>
       <w:r>
         <w:rPr>
           <w:b/>
@@ -578,20 +525,10 @@
         </w:rPr>
         <w:t>PhysicsWorld</w:t>
       </w:r>
-      <w:proofErr w:type="spellEnd"/>
-      <w:proofErr w:type="gramEnd"/>
-    </w:p>
-    <w:p>
-      <w:r>
-        <w:t xml:space="preserve">The </w:t>
-      </w:r>
-      <w:proofErr w:type="spellStart"/>
-      <w:r>
-        <w:t>PhysicsWorld</w:t>
-      </w:r>
-      <w:proofErr w:type="spellEnd"/>
-      <w:r>
-        <w:t xml:space="preserve"> is the </w:t>
+    </w:p>
+    <w:p>
+      <w:r>
+        <w:t xml:space="preserve">The PhysicsWorld is the </w:t>
       </w:r>
       <w:r>
         <w:rPr>
@@ -655,13 +592,8 @@
       </w:r>
     </w:p>
     <w:p>
-      <w:proofErr w:type="spellStart"/>
-      <w:r>
-        <w:t>RigidBodies</w:t>
-      </w:r>
-      <w:proofErr w:type="spellEnd"/>
-      <w:r>
-        <w:t xml:space="preserve"> never update themselves independently.</w:t>
+      <w:r>
+        <w:t>RigidBodies never update themselves independently.</w:t>
       </w:r>
     </w:p>
     <w:p/>
@@ -680,21 +612,12 @@
           <w:bCs/>
         </w:rPr>
       </w:pPr>
-      <w:proofErr w:type="spellStart"/>
-      <w:r>
-        <w:rPr>
-          <w:b/>
-          <w:bCs/>
-        </w:rPr>
-        <w:t>RigidBody</w:t>
-      </w:r>
-      <w:proofErr w:type="spellEnd"/>
-      <w:r>
-        <w:rPr>
-          <w:b/>
-          <w:bCs/>
-        </w:rPr>
-        <w:t xml:space="preserve"> State</w:t>
+      <w:r>
+        <w:rPr>
+          <w:b/>
+          <w:bCs/>
+        </w:rPr>
+        <w:t>RigidBody State</w:t>
       </w:r>
     </w:p>
     <w:p>
@@ -830,13 +753,8 @@
         </w:numPr>
       </w:pPr>
       <w:r>
-        <w:t xml:space="preserve">Act </w:t>
-      </w:r>
-      <w:proofErr w:type="gramStart"/>
-      <w:r>
-        <w:t>over time</w:t>
-      </w:r>
-      <w:proofErr w:type="gramEnd"/>
+        <w:t>Act over time</w:t>
+      </w:r>
     </w:p>
     <w:p>
       <w:pPr>
@@ -1050,13 +968,8 @@
         </w:numPr>
       </w:pPr>
       <w:r>
-        <w:t xml:space="preserve">Applied by the </w:t>
-      </w:r>
-      <w:proofErr w:type="spellStart"/>
-      <w:r>
-        <w:t>PhysicsWorld</w:t>
-      </w:r>
-      <w:proofErr w:type="spellEnd"/>
+        <w:t>Applied by the PhysicsWorld</w:t>
+      </w:r>
     </w:p>
     <w:p>
       <w:pPr>
@@ -1076,23 +989,13 @@
           <w:numId w:val="11"/>
         </w:numPr>
       </w:pPr>
-      <w:proofErr w:type="gramStart"/>
       <w:r>
         <w:t>Not hard</w:t>
       </w:r>
       <w:r>
         <w:noBreakHyphen/>
-        <w:t>coded</w:t>
-      </w:r>
-      <w:proofErr w:type="gramEnd"/>
-      <w:r>
-        <w:t xml:space="preserve"> into </w:t>
-      </w:r>
-      <w:proofErr w:type="spellStart"/>
-      <w:r>
-        <w:t>RigidBody</w:t>
-      </w:r>
-      <w:proofErr w:type="spellEnd"/>
+        <w:t>coded into RigidBody</w:t>
+      </w:r>
     </w:p>
     <w:p>
       <w:r>
@@ -1321,15 +1224,7 @@
         </w:numPr>
       </w:pPr>
       <w:r>
-        <w:t xml:space="preserve">Bodies with </w:t>
-      </w:r>
-      <w:proofErr w:type="spellStart"/>
-      <w:r>
-        <w:t>inverseMass</w:t>
-      </w:r>
-      <w:proofErr w:type="spellEnd"/>
-      <w:r>
-        <w:t xml:space="preserve"> == 0 are static</w:t>
+        <w:t>Bodies with inverseMass == 0 are static</w:t>
       </w:r>
     </w:p>
     <w:p>
@@ -1520,200 +1415,283 @@
         </w:numPr>
       </w:pPr>
       <w:r>
-        <w:t xml:space="preserve">Time accumulation is handled by </w:t>
-      </w:r>
-      <w:proofErr w:type="spellStart"/>
+        <w:t>Time accumulation is handled by PhysicsWorld</w:t>
+      </w:r>
+    </w:p>
+    <w:p>
+      <w:pPr>
+        <w:numPr>
+          <w:ilvl w:val="0"/>
+          <w:numId w:val="17"/>
+        </w:numPr>
+      </w:pPr>
+      <w:r>
+        <w:t>Interpolation is planned but not implemented in Phase</w:t>
+      </w:r>
+      <w:r>
+        <w:rPr>
+          <w:rFonts w:ascii="Arial" w:hAnsi="Arial" w:cs="Arial"/>
+        </w:rPr>
+        <w:t> </w:t>
+      </w:r>
+      <w:r>
+        <w:t>A</w:t>
+      </w:r>
+    </w:p>
+    <w:p>
+      <w:r>
+        <w:t>This design ensures stability and determinism.</w:t>
+      </w:r>
+    </w:p>
+    <w:p>
+      <w:pPr>
+        <w:rPr>
+          <w:b/>
+          <w:bCs/>
+        </w:rPr>
+      </w:pPr>
+    </w:p>
+    <w:p>
+      <w:pPr>
+        <w:pStyle w:val="Heading2"/>
+      </w:pPr>
+      <w:r>
+        <w:t>11. Phase</w:t>
+      </w:r>
+      <w:r>
+        <w:rPr>
+          <w:rFonts w:ascii="Arial" w:hAnsi="Arial" w:cs="Arial"/>
+        </w:rPr>
+        <w:t> </w:t>
+      </w:r>
+      <w:r>
+        <w:t>A Success Criteria</w:t>
+      </w:r>
+    </w:p>
+    <w:p>
+      <w:r>
+        <w:t>Phase</w:t>
+      </w:r>
+      <w:r>
+        <w:rPr>
+          <w:rFonts w:ascii="Arial" w:hAnsi="Arial" w:cs="Arial"/>
+        </w:rPr>
+        <w:t> </w:t>
+      </w:r>
+      <w:r>
+        <w:t>A is considered complete when:</w:t>
+      </w:r>
+    </w:p>
+    <w:p>
+      <w:pPr>
+        <w:numPr>
+          <w:ilvl w:val="0"/>
+          <w:numId w:val="18"/>
+        </w:numPr>
+      </w:pPr>
+      <w:r>
+        <w:t>Bodies fall under gravity correctly</w:t>
+      </w:r>
+    </w:p>
+    <w:p>
+      <w:pPr>
+        <w:numPr>
+          <w:ilvl w:val="0"/>
+          <w:numId w:val="18"/>
+        </w:numPr>
+      </w:pPr>
+      <w:r>
+        <w:t>Forces accumulate and clear properly</w:t>
+      </w:r>
+    </w:p>
+    <w:p>
+      <w:pPr>
+        <w:numPr>
+          <w:ilvl w:val="0"/>
+          <w:numId w:val="18"/>
+        </w:numPr>
+      </w:pPr>
+      <w:r>
+        <w:t>Angular motion behaves independently</w:t>
+      </w:r>
+    </w:p>
+    <w:p>
+      <w:pPr>
+        <w:numPr>
+          <w:ilvl w:val="0"/>
+          <w:numId w:val="18"/>
+        </w:numPr>
+      </w:pPr>
+      <w:r>
+        <w:t>Static bodies remain immobile</w:t>
+      </w:r>
+    </w:p>
+    <w:p>
+      <w:pPr>
+        <w:numPr>
+          <w:ilvl w:val="0"/>
+          <w:numId w:val="18"/>
+        </w:numPr>
+      </w:pPr>
+      <w:r>
+        <w:t>Multiple bodies simulate independently</w:t>
+      </w:r>
+    </w:p>
+    <w:p>
+      <w:pPr>
+        <w:numPr>
+          <w:ilvl w:val="0"/>
+          <w:numId w:val="18"/>
+        </w:numPr>
+      </w:pPr>
+      <w:r>
+        <w:t>Results are deterministic with a fixed timestep</w:t>
+      </w:r>
+    </w:p>
+    <w:p>
+      <w:pPr>
+        <w:numPr>
+          <w:ilvl w:val="0"/>
+          <w:numId w:val="18"/>
+        </w:numPr>
+      </w:pPr>
+      <w:r>
+        <w:t>No collision logic exists yet</w:t>
+      </w:r>
+    </w:p>
+    <w:p>
+      <w:pPr>
+        <w:rPr>
+          <w:b/>
+          <w:bCs/>
+        </w:rPr>
+      </w:pPr>
+    </w:p>
+    <w:p>
+      <w:pPr>
+        <w:pStyle w:val="Heading2"/>
+      </w:pPr>
+      <w:r>
+        <w:t>12. Overall Physics Engine Roadmap</w:t>
+      </w:r>
+    </w:p>
+    <w:p>
+      <w:pPr>
+        <w:rPr>
+          <w:b/>
+          <w:bCs/>
+        </w:rPr>
+      </w:pPr>
+      <w:r>
+        <w:rPr>
+          <w:b/>
+          <w:bCs/>
+        </w:rPr>
+        <w:t>Phase</w:t>
+      </w:r>
+      <w:r>
+        <w:rPr>
+          <w:rFonts w:ascii="Arial" w:hAnsi="Arial" w:cs="Arial"/>
+          <w:b/>
+          <w:bCs/>
+        </w:rPr>
+        <w:t> </w:t>
+      </w:r>
+      <w:r>
+        <w:rPr>
+          <w:b/>
+          <w:bCs/>
+        </w:rPr>
+        <w:t xml:space="preserve">A </w:t>
+      </w:r>
+      <w:r>
+        <w:rPr>
+          <w:rFonts w:ascii="Aptos" w:hAnsi="Aptos" w:cs="Aptos"/>
+          <w:b/>
+          <w:bCs/>
+        </w:rPr>
+        <w:t>—</w:t>
+      </w:r>
+      <w:r>
+        <w:rPr>
+          <w:b/>
+          <w:bCs/>
+        </w:rPr>
+        <w:t xml:space="preserve"> Core Motion</w:t>
+      </w:r>
+    </w:p>
+    <w:p>
+      <w:pPr>
+        <w:numPr>
+          <w:ilvl w:val="0"/>
+          <w:numId w:val="19"/>
+        </w:numPr>
+      </w:pPr>
+      <w:r>
+        <w:t>RigidBody</w:t>
+      </w:r>
+    </w:p>
+    <w:p>
+      <w:pPr>
+        <w:numPr>
+          <w:ilvl w:val="0"/>
+          <w:numId w:val="19"/>
+        </w:numPr>
+      </w:pPr>
+      <w:r>
+        <w:t>Forces and torques</w:t>
+      </w:r>
+    </w:p>
+    <w:p>
+      <w:pPr>
+        <w:numPr>
+          <w:ilvl w:val="0"/>
+          <w:numId w:val="19"/>
+        </w:numPr>
+      </w:pPr>
+      <w:r>
+        <w:t>Integration</w:t>
+      </w:r>
+    </w:p>
+    <w:p>
+      <w:pPr>
+        <w:numPr>
+          <w:ilvl w:val="0"/>
+          <w:numId w:val="19"/>
+        </w:numPr>
+      </w:pPr>
       <w:r>
         <w:t>PhysicsWorld</w:t>
       </w:r>
-      <w:proofErr w:type="spellEnd"/>
-    </w:p>
-    <w:p>
-      <w:pPr>
-        <w:numPr>
-          <w:ilvl w:val="0"/>
-          <w:numId w:val="17"/>
-        </w:numPr>
-      </w:pPr>
-      <w:r>
-        <w:t>Interpolation is planned but not implemented in Phase</w:t>
+    </w:p>
+    <w:p>
+      <w:pPr>
+        <w:rPr>
+          <w:b/>
+          <w:bCs/>
+        </w:rPr>
+      </w:pPr>
+      <w:r>
+        <w:rPr>
+          <w:b/>
+          <w:bCs/>
+        </w:rPr>
+        <w:t>Phase</w:t>
       </w:r>
       <w:r>
         <w:rPr>
           <w:rFonts w:ascii="Arial" w:hAnsi="Arial" w:cs="Arial"/>
+          <w:b/>
+          <w:bCs/>
         </w:rPr>
         <w:t> </w:t>
       </w:r>
       <w:r>
-        <w:t>A</w:t>
-      </w:r>
-    </w:p>
-    <w:p>
-      <w:r>
-        <w:t>This design ensures stability and determinism.</w:t>
-      </w:r>
-    </w:p>
-    <w:p>
-      <w:pPr>
-        <w:rPr>
-          <w:b/>
-          <w:bCs/>
-        </w:rPr>
-      </w:pPr>
-    </w:p>
-    <w:p>
-      <w:pPr>
-        <w:pStyle w:val="Heading2"/>
-      </w:pPr>
-      <w:r>
-        <w:t>11. Phase</w:t>
-      </w:r>
-      <w:r>
-        <w:rPr>
-          <w:rFonts w:ascii="Arial" w:hAnsi="Arial" w:cs="Arial"/>
-        </w:rPr>
-        <w:t> </w:t>
-      </w:r>
-      <w:r>
-        <w:t>A Success Criteria</w:t>
-      </w:r>
-    </w:p>
-    <w:p>
-      <w:r>
-        <w:t>Phase</w:t>
-      </w:r>
-      <w:r>
-        <w:rPr>
-          <w:rFonts w:ascii="Arial" w:hAnsi="Arial" w:cs="Arial"/>
-        </w:rPr>
-        <w:t> </w:t>
-      </w:r>
-      <w:r>
-        <w:t>A is considered complete when:</w:t>
-      </w:r>
-    </w:p>
-    <w:p>
-      <w:pPr>
-        <w:numPr>
-          <w:ilvl w:val="0"/>
-          <w:numId w:val="18"/>
-        </w:numPr>
-      </w:pPr>
-      <w:r>
-        <w:t>Bodies fall under gravity correctly</w:t>
-      </w:r>
-    </w:p>
-    <w:p>
-      <w:pPr>
-        <w:numPr>
-          <w:ilvl w:val="0"/>
-          <w:numId w:val="18"/>
-        </w:numPr>
-      </w:pPr>
-      <w:r>
-        <w:t>Forces accumulate and clear properly</w:t>
-      </w:r>
-    </w:p>
-    <w:p>
-      <w:pPr>
-        <w:numPr>
-          <w:ilvl w:val="0"/>
-          <w:numId w:val="18"/>
-        </w:numPr>
-      </w:pPr>
-      <w:r>
-        <w:t>Angular motion behaves independently</w:t>
-      </w:r>
-    </w:p>
-    <w:p>
-      <w:pPr>
-        <w:numPr>
-          <w:ilvl w:val="0"/>
-          <w:numId w:val="18"/>
-        </w:numPr>
-      </w:pPr>
-      <w:r>
-        <w:t>Static bodies remain immobile</w:t>
-      </w:r>
-    </w:p>
-    <w:p>
-      <w:pPr>
-        <w:numPr>
-          <w:ilvl w:val="0"/>
-          <w:numId w:val="18"/>
-        </w:numPr>
-      </w:pPr>
-      <w:r>
-        <w:t>Multiple bodies simulate independently</w:t>
-      </w:r>
-    </w:p>
-    <w:p>
-      <w:pPr>
-        <w:numPr>
-          <w:ilvl w:val="0"/>
-          <w:numId w:val="18"/>
-        </w:numPr>
-      </w:pPr>
-      <w:r>
-        <w:t>Results are deterministic with a fixed timestep</w:t>
-      </w:r>
-    </w:p>
-    <w:p>
-      <w:pPr>
-        <w:numPr>
-          <w:ilvl w:val="0"/>
-          <w:numId w:val="18"/>
-        </w:numPr>
-      </w:pPr>
-      <w:r>
-        <w:t>No collision logic exists yet</w:t>
-      </w:r>
-    </w:p>
-    <w:p>
-      <w:pPr>
-        <w:rPr>
-          <w:b/>
-          <w:bCs/>
-        </w:rPr>
-      </w:pPr>
-    </w:p>
-    <w:p>
-      <w:pPr>
-        <w:pStyle w:val="Heading2"/>
-      </w:pPr>
-      <w:r>
-        <w:t>12. Overall Physics Engine Roadmap</w:t>
-      </w:r>
-    </w:p>
-    <w:p>
-      <w:pPr>
-        <w:rPr>
-          <w:b/>
-          <w:bCs/>
-        </w:rPr>
-      </w:pPr>
-      <w:proofErr w:type="gramStart"/>
-      <w:r>
-        <w:rPr>
-          <w:b/>
-          <w:bCs/>
-        </w:rPr>
-        <w:t>Phase</w:t>
-      </w:r>
-      <w:r>
-        <w:rPr>
-          <w:rFonts w:ascii="Arial" w:hAnsi="Arial" w:cs="Arial"/>
-          <w:b/>
-          <w:bCs/>
-        </w:rPr>
-        <w:t> </w:t>
-      </w:r>
-      <w:r>
-        <w:rPr>
-          <w:b/>
-          <w:bCs/>
-        </w:rPr>
-        <w:t xml:space="preserve">A </w:t>
+        <w:rPr>
+          <w:b/>
+          <w:bCs/>
+        </w:rPr>
+        <w:t xml:space="preserve">B </w:t>
       </w:r>
       <w:r>
         <w:rPr>
@@ -1723,118 +1701,6 @@
         </w:rPr>
         <w:t>—</w:t>
       </w:r>
-      <w:proofErr w:type="gramEnd"/>
-      <w:r>
-        <w:rPr>
-          <w:b/>
-          <w:bCs/>
-        </w:rPr>
-        <w:t xml:space="preserve"> Core Motion </w:t>
-      </w:r>
-      <w:r>
-        <w:rPr>
-          <w:b/>
-          <w:bCs/>
-          <w:i/>
-          <w:iCs/>
-        </w:rPr>
-        <w:t>(current phase)</w:t>
-      </w:r>
-    </w:p>
-    <w:p>
-      <w:pPr>
-        <w:numPr>
-          <w:ilvl w:val="0"/>
-          <w:numId w:val="19"/>
-        </w:numPr>
-      </w:pPr>
-      <w:proofErr w:type="spellStart"/>
-      <w:r>
-        <w:t>RigidBody</w:t>
-      </w:r>
-      <w:proofErr w:type="spellEnd"/>
-    </w:p>
-    <w:p>
-      <w:pPr>
-        <w:numPr>
-          <w:ilvl w:val="0"/>
-          <w:numId w:val="19"/>
-        </w:numPr>
-      </w:pPr>
-      <w:r>
-        <w:t xml:space="preserve">Forces and </w:t>
-      </w:r>
-      <w:proofErr w:type="gramStart"/>
-      <w:r>
-        <w:t>torques</w:t>
-      </w:r>
-      <w:proofErr w:type="gramEnd"/>
-    </w:p>
-    <w:p>
-      <w:pPr>
-        <w:numPr>
-          <w:ilvl w:val="0"/>
-          <w:numId w:val="19"/>
-        </w:numPr>
-      </w:pPr>
-      <w:r>
-        <w:t>Integration</w:t>
-      </w:r>
-    </w:p>
-    <w:p>
-      <w:pPr>
-        <w:numPr>
-          <w:ilvl w:val="0"/>
-          <w:numId w:val="19"/>
-        </w:numPr>
-      </w:pPr>
-      <w:proofErr w:type="spellStart"/>
-      <w:proofErr w:type="gramStart"/>
-      <w:r>
-        <w:t>PhysicsWorld</w:t>
-      </w:r>
-      <w:proofErr w:type="spellEnd"/>
-      <w:proofErr w:type="gramEnd"/>
-    </w:p>
-    <w:p>
-      <w:pPr>
-        <w:rPr>
-          <w:b/>
-          <w:bCs/>
-        </w:rPr>
-      </w:pPr>
-      <w:proofErr w:type="gramStart"/>
-      <w:r>
-        <w:rPr>
-          <w:b/>
-          <w:bCs/>
-        </w:rPr>
-        <w:t>Phase</w:t>
-      </w:r>
-      <w:r>
-        <w:rPr>
-          <w:rFonts w:ascii="Arial" w:hAnsi="Arial" w:cs="Arial"/>
-          <w:b/>
-          <w:bCs/>
-        </w:rPr>
-        <w:t> </w:t>
-      </w:r>
-      <w:r>
-        <w:rPr>
-          <w:b/>
-          <w:bCs/>
-        </w:rPr>
-        <w:t xml:space="preserve">B </w:t>
-      </w:r>
-      <w:r>
-        <w:rPr>
-          <w:rFonts w:ascii="Aptos" w:hAnsi="Aptos" w:cs="Aptos"/>
-          <w:b/>
-          <w:bCs/>
-        </w:rPr>
-        <w:t>—</w:t>
-      </w:r>
-      <w:proofErr w:type="gramEnd"/>
       <w:r>
         <w:rPr>
           <w:b/>
@@ -1861,11 +1727,9 @@
           <w:numId w:val="20"/>
         </w:numPr>
       </w:pPr>
-      <w:proofErr w:type="spellStart"/>
       <w:r>
         <w:t>Broadphase</w:t>
       </w:r>
-      <w:proofErr w:type="spellEnd"/>
     </w:p>
     <w:p>
       <w:pPr>
@@ -1874,11 +1738,9 @@
           <w:numId w:val="20"/>
         </w:numPr>
       </w:pPr>
-      <w:proofErr w:type="spellStart"/>
       <w:r>
         <w:t>Narrowphase</w:t>
       </w:r>
-      <w:proofErr w:type="spellEnd"/>
     </w:p>
     <w:p>
       <w:pPr>
@@ -1898,7 +1760,6 @@
           <w:bCs/>
         </w:rPr>
       </w:pPr>
-      <w:proofErr w:type="gramStart"/>
       <w:r>
         <w:rPr>
           <w:b/>
@@ -1930,7 +1791,6 @@
         </w:rPr>
         <w:t>—</w:t>
       </w:r>
-      <w:proofErr w:type="gramEnd"/>
       <w:r>
         <w:rPr>
           <w:b/>
@@ -1990,7 +1850,6 @@
           <w:bCs/>
         </w:rPr>
       </w:pPr>
-      <w:proofErr w:type="gramStart"/>
       <w:r>
         <w:rPr>
           <w:b/>
@@ -2021,7 +1880,6 @@
         </w:rPr>
         <w:t>—</w:t>
       </w:r>
-      <w:proofErr w:type="gramEnd"/>
       <w:r>
         <w:rPr>
           <w:b/>
@@ -2081,7 +1939,6 @@
           <w:bCs/>
         </w:rPr>
       </w:pPr>
-      <w:proofErr w:type="gramStart"/>
       <w:r>
         <w:rPr>
           <w:b/>
@@ -2112,7 +1969,6 @@
         </w:rPr>
         <w:t>—</w:t>
       </w:r>
-      <w:proofErr w:type="gramEnd"/>
       <w:r>
         <w:rPr>
           <w:b/>
@@ -2129,15 +1985,7 @@
         </w:numPr>
       </w:pPr>
       <w:r>
-        <w:t xml:space="preserve">Optional </w:t>
-      </w:r>
-      <w:proofErr w:type="spellStart"/>
-      <w:r>
-        <w:t>Irrlicht</w:t>
-      </w:r>
-      <w:proofErr w:type="spellEnd"/>
-      <w:r>
-        <w:t xml:space="preserve"> adapter</w:t>
+        <w:t>Optional Irrlicht adapter</w:t>
       </w:r>
     </w:p>
     <w:p>
@@ -2169,7 +2017,6 @@
           <w:bCs/>
         </w:rPr>
       </w:pPr>
-      <w:proofErr w:type="gramStart"/>
       <w:r>
         <w:rPr>
           <w:b/>
@@ -2200,7 +2047,6 @@
         </w:rPr>
         <w:t>—</w:t>
       </w:r>
-      <w:proofErr w:type="gramEnd"/>
       <w:r>
         <w:rPr>
           <w:b/>
@@ -2243,14 +2089,7 @@
       </w:r>
       <w:r>
         <w:noBreakHyphen/>
-      </w:r>
-      <w:proofErr w:type="spellStart"/>
-      <w:r>
-        <w:t>rigidbody</w:t>
-      </w:r>
-      <w:proofErr w:type="spellEnd"/>
-      <w:r>
-        <w:t xml:space="preserve"> interaction</w:t>
+        <w:t>rigidbody interaction</w:t>
       </w:r>
     </w:p>
     <w:p/>
@@ -6410,6 +6249,7 @@
   <w:style w:type="character" w:default="1" w:styleId="DefaultParagraphFont">
     <w:name w:val="Default Paragraph Font"/>
     <w:uiPriority w:val="1"/>
+    <w:semiHidden/>
     <w:unhideWhenUsed/>
   </w:style>
   <w:style w:type="table" w:default="1" w:styleId="TableNormal">

</xml_diff>